<commit_message>
fix: match docx template field names for certificate location
</commit_message>
<xml_diff>
--- a/front/public/docs/Coordenador-Requerimento.docx
+++ b/front/public/docs/Coordenador-Requerimento.docx
@@ -2961,25 +2961,6 @@
           <w:szCs w:val="24"/>
           <w:rtl w:val="0"/>
         </w:rPr>
-        <w:t xml:space="preserve">)</w:t>
-      </w:r>
-    </w:p>
-    <w:p>
-      <w:pPr>
-        <w:ind w:right="1759"/>
-        <w:rPr>
-          <w:rFonts w:ascii="Calibri" w:cs="Calibri" w:eastAsia="Calibri" w:hAnsi="Calibri"/>
-          <w:sz w:val="24"/>
-          <w:szCs w:val="24"/>
-        </w:rPr>
-      </w:pPr>
-      <w:r>
-        <w:rPr>
-          <w:rFonts w:ascii="Calibri" w:cs="Calibri" w:eastAsia="Calibri" w:hAnsi="Calibri"/>
-          <w:sz w:val="24"/>
-          <w:szCs w:val="24"/>
-          <w:rtl w:val="0"/>
-        </w:rPr>
         <w:t xml:space="preserve">{/certs}</w:t>
       </w:r>
     </w:p>

</xml_diff>